<commit_message>
Actualizar valor de restitución de equipos en el documento de cargo celular
</commit_message>
<xml_diff>
--- a/storage/app/templates/cargo-celular.docx
+++ b/storage/app/templates/cargo-celular.docx
@@ -708,7 +708,7 @@
           <w:sz w:val="20"/>
           <w:highlight w:val="yellow"/>
         </w:rPr>
-        <w:t>2</w:t>
+        <w:t>549</w:t>
       </w:r>
       <w:r>
         <w:rPr>
@@ -718,7 +718,7 @@
           <w:sz w:val="20"/>
           <w:highlight w:val="yellow"/>
         </w:rPr>
-        <w:t>50</w:t>
+        <w:t>.00</w:t>
       </w:r>
       <w:r>
         <w:rPr>
@@ -728,7 +728,7 @@
           <w:sz w:val="20"/>
           <w:highlight w:val="yellow"/>
         </w:rPr>
-        <w:t>.00</w:t>
+        <w:t xml:space="preserve"> (celular</w:t>
       </w:r>
       <w:r>
         <w:rPr>
@@ -738,7 +738,7 @@
           <w:sz w:val="20"/>
           <w:highlight w:val="yellow"/>
         </w:rPr>
-        <w:t xml:space="preserve"> (celular</w:t>
+        <w:t xml:space="preserve"> + cargador + cable de red</w:t>
       </w:r>
       <w:r>
         <w:rPr>

</xml_diff>